<commit_message>
Actualizar documentos y trasladar entregables a Fase 2
</commit_message>
<xml_diff>
--- a/Evaluación-fase-1/ALEXANDER/Informe Alexander Lopez 1.3_APT122_AutoevaluacionFase1.docx
+++ b/Evaluación-fase-1/ALEXANDER/Informe Alexander Lopez 1.3_APT122_AutoevaluacionFase1.docx
@@ -2,72 +2,6 @@
 <file path=word/document.xml><?xml version="1.0" encoding="utf-8"?>
 <w:document xmlns:mc="http://schemas.openxmlformats.org/markup-compatibility/2006" xmlns:o="urn:schemas-microsoft-com:office:office" xmlns:r="http://schemas.openxmlformats.org/officeDocument/2006/relationships" xmlns:m="http://schemas.openxmlformats.org/officeDocument/2006/math" xmlns:v="urn:schemas-microsoft-com:vml" xmlns:wp="http://schemas.openxmlformats.org/drawingml/2006/wordprocessingDrawing" xmlns:w10="urn:schemas-microsoft-com:office:word" xmlns:w="http://schemas.openxmlformats.org/wordprocessingml/2006/main" xmlns:wne="http://schemas.microsoft.com/office/word/2006/wordml" xmlns:sl="http://schemas.openxmlformats.org/schemaLibrary/2006/main" xmlns:a="http://schemas.openxmlformats.org/drawingml/2006/main" xmlns:pic="http://schemas.openxmlformats.org/drawingml/2006/picture" xmlns:c="http://schemas.openxmlformats.org/drawingml/2006/chart" xmlns:lc="http://schemas.openxmlformats.org/drawingml/2006/lockedCanvas" xmlns:dgm="http://schemas.openxmlformats.org/drawingml/2006/diagram" xmlns:wps="http://schemas.microsoft.com/office/word/2010/wordprocessingShape" xmlns:wpg="http://schemas.microsoft.com/office/word/2010/wordprocessingGroup" xmlns:w14="http://schemas.microsoft.com/office/word/2010/wordml" xmlns:w15="http://schemas.microsoft.com/office/word/2012/wordml" xmlns:w16="http://schemas.microsoft.com/office/word/2018/wordml" xmlns:w16cex="http://schemas.microsoft.com/office/word/2018/wordml/cex" xmlns:w16cid="http://schemas.microsoft.com/office/word/2016/wordml/cid" xmlns="http://schemas.microsoft.com/office/tasks/2019/documenttasks" xmlns:cr="http://schemas.microsoft.com/office/comments/2020/reactions">
   <w:body>
-    <w:p>
-      <w:pPr>
-        <w:pStyle w:val="Title"/>
-        <w:keepNext w:val="0"/>
-        <w:keepLines w:val="0"/>
-        <w:pageBreakBefore w:val="0"/>
-        <w:widowControl w:val="0"/>
-        <w:pBdr>
-          <w:top w:space="0" w:sz="0" w:val="nil"/>
-          <w:left w:space="0" w:sz="0" w:val="nil"/>
-          <w:bottom w:space="0" w:sz="0" w:val="nil"/>
-          <w:right w:space="0" w:sz="0" w:val="nil"/>
-          <w:between w:space="0" w:sz="0" w:val="nil"/>
-        </w:pBdr>
-        <w:shd w:fill="auto" w:val="clear"/>
-        <w:spacing w:after="0" w:before="0" w:line="276" w:lineRule="auto"/>
-        <w:ind w:left="0" w:right="0" w:firstLine="0"/>
-        <w:jc w:val="left"/>
-        <w:rPr>
-          <w:rFonts w:ascii="Arial" w:cs="Arial" w:eastAsia="Arial" w:hAnsi="Arial"/>
-          <w:b w:val="0"/>
-          <w:bCs w:val="0"/>
-          <w:i w:val="0"/>
-          <w:iCs w:val="0"/>
-          <w:smallCaps w:val="0"/>
-          <w:strike w:val="0"/>
-          <w:color w:val="000000"/>
-          <w:sz w:val="22"/>
-          <w:szCs w:val="22"/>
-          <w:u w:val="none"/>
-          <w:shd w:fill="auto" w:val="clear"/>
-          <w:vertAlign w:val="baseline"/>
-        </w:rPr>
-        <w:sectPr>
-          <w:pgSz w:h="16834" w:w="11909" w:orient="portrait"/>
-          <w:pgMar w:bottom="1440" w:top="1440" w:left="1440" w:right="1440" w:header="720" w:footer="720"/>
-          <w:pgNumType w:start="1"/>
-        </w:sectPr>
-      </w:pPr>
-      <w:bookmarkStart w:colFirst="0" w:colLast="0" w:name="_3knp55f0oq7l" w:id="0"/>
-      <w:bookmarkEnd w:id="0"/>
-      <w:r>
-        <w:rPr>
-          <w:rFonts w:ascii="Arial" w:cs="Arial" w:eastAsia="Arial" w:hAnsi="Arial"/>
-          <w:b w:val="0"/>
-          <w:bCs w:val="0"/>
-          <w:i w:val="0"/>
-          <w:iCs w:val="0"/>
-          <w:smallCaps w:val="0"/>
-          <w:strike w:val="0"/>
-          <w:color w:val="000000"/>
-          <w:sz w:val="52"/>
-          <w:szCs w:val="52"/>
-          <w:u w:val="none"/>
-          <w:shd w:fill="auto" w:val="clear"/>
-          <w:vertAlign w:val="baseline"/>
-          <w:rtl w:val="0"/>
-        </w:rPr>
-        <w:t xml:space="preserve">Informe Autoevaluacion Fase1</w:t>
-      </w:r>
-      <w:r>
-        <w:rPr>
-          <w:rtl w:val="0"/>
-        </w:rPr>
-      </w:r>
-    </w:p>
     <w:p>
       <w:pPr>
         <w:spacing w:after="160" w:line="259" w:lineRule="auto"/>
@@ -94,12 +28,12 @@
             <wp:extent cx="2128838" cy="1194896"/>
             <wp:effectExtent b="0" l="0" r="0" t="0"/>
             <wp:wrapSquare wrapText="bothSides" distB="114300" distT="114300" distL="114300" distR="114300"/>
-            <wp:docPr id="13" name="image1.jpg"/>
+            <wp:docPr id="15" name="image2.jpg"/>
             <a:graphic>
               <a:graphicData uri="http://schemas.openxmlformats.org/drawingml/2006/picture">
                 <pic:pic>
                   <pic:nvPicPr>
-                    <pic:cNvPr id="0" name="image1.jpg"/>
+                    <pic:cNvPr id="0" name="image2.jpg"/>
                     <pic:cNvPicPr preferRelativeResize="0"/>
                   </pic:nvPicPr>
                   <pic:blipFill>
@@ -156,12 +90,12 @@
           <wp:inline distB="0" distT="0" distL="0" distR="0">
             <wp:extent cx="1996440" cy="428625"/>
             <wp:effectExtent b="0" l="0" r="0" t="0"/>
-            <wp:docPr descr="http://www.duoc.cl/normasgraficas/normasgraficas/marca-duoc/6logo-fondo-transparente/fondo-transparente.png" id="2" name="image2.png"/>
+            <wp:docPr descr="http://www.duoc.cl/normasgraficas/normasgraficas/marca-duoc/6logo-fondo-transparente/fondo-transparente.png" id="9" name="image1.png"/>
             <a:graphic>
               <a:graphicData uri="http://schemas.openxmlformats.org/drawingml/2006/picture">
                 <pic:pic>
                   <pic:nvPicPr>
-                    <pic:cNvPr descr="http://www.duoc.cl/normasgraficas/normasgraficas/marca-duoc/6logo-fondo-transparente/fondo-transparente.png" id="0" name="image2.png"/>
+                    <pic:cNvPr descr="http://www.duoc.cl/normasgraficas/normasgraficas/marca-duoc/6logo-fondo-transparente/fondo-transparente.png" id="0" name="image1.png"/>
                     <pic:cNvPicPr preferRelativeResize="0"/>
                   </pic:nvPicPr>
                   <pic:blipFill>
@@ -530,12 +464,12 @@
           <wp:inline distB="0" distT="0" distL="0" distR="0">
             <wp:extent cx="1996440" cy="428625"/>
             <wp:effectExtent b="0" l="0" r="0" t="0"/>
-            <wp:docPr descr="http://www.duoc.cl/normasgraficas/normasgraficas/marca-duoc/6logo-fondo-transparente/fondo-transparente.png" id="10" name="image2.png"/>
+            <wp:docPr descr="http://www.duoc.cl/normasgraficas/normasgraficas/marca-duoc/6logo-fondo-transparente/fondo-transparente.png" id="3" name="image1.png"/>
             <a:graphic>
               <a:graphicData uri="http://schemas.openxmlformats.org/drawingml/2006/picture">
                 <pic:pic>
                   <pic:nvPicPr>
-                    <pic:cNvPr descr="http://www.duoc.cl/normasgraficas/normasgraficas/marca-duoc/6logo-fondo-transparente/fondo-transparente.png" id="0" name="image2.png"/>
+                    <pic:cNvPr descr="http://www.duoc.cl/normasgraficas/normasgraficas/marca-duoc/6logo-fondo-transparente/fondo-transparente.png" id="0" name="image1.png"/>
                     <pic:cNvPicPr preferRelativeResize="0"/>
                   </pic:nvPicPr>
                   <pic:blipFill>
@@ -858,12 +792,12 @@
           <wp:inline distB="0" distT="0" distL="0" distR="0">
             <wp:extent cx="1996440" cy="428625"/>
             <wp:effectExtent b="0" l="0" r="0" t="0"/>
-            <wp:docPr descr="http://www.duoc.cl/normasgraficas/normasgraficas/marca-duoc/6logo-fondo-transparente/fondo-transparente.png" id="8" name="image2.png"/>
+            <wp:docPr descr="http://www.duoc.cl/normasgraficas/normasgraficas/marca-duoc/6logo-fondo-transparente/fondo-transparente.png" id="7" name="image1.png"/>
             <a:graphic>
               <a:graphicData uri="http://schemas.openxmlformats.org/drawingml/2006/picture">
                 <pic:pic>
                   <pic:nvPicPr>
-                    <pic:cNvPr descr="http://www.duoc.cl/normasgraficas/normasgraficas/marca-duoc/6logo-fondo-transparente/fondo-transparente.png" id="0" name="image2.png"/>
+                    <pic:cNvPr descr="http://www.duoc.cl/normasgraficas/normasgraficas/marca-duoc/6logo-fondo-transparente/fondo-transparente.png" id="0" name="image1.png"/>
                     <pic:cNvPicPr preferRelativeResize="0"/>
                   </pic:nvPicPr>
                   <pic:blipFill>
@@ -1255,12 +1189,12 @@
           <wp:inline distB="0" distT="0" distL="0" distR="0">
             <wp:extent cx="1996440" cy="428625"/>
             <wp:effectExtent b="0" l="0" r="0" t="0"/>
-            <wp:docPr descr="http://www.duoc.cl/normasgraficas/normasgraficas/marca-duoc/6logo-fondo-transparente/fondo-transparente.png" id="7" name="image2.png"/>
+            <wp:docPr descr="http://www.duoc.cl/normasgraficas/normasgraficas/marca-duoc/6logo-fondo-transparente/fondo-transparente.png" id="2" name="image1.png"/>
             <a:graphic>
               <a:graphicData uri="http://schemas.openxmlformats.org/drawingml/2006/picture">
                 <pic:pic>
                   <pic:nvPicPr>
-                    <pic:cNvPr descr="http://www.duoc.cl/normasgraficas/normasgraficas/marca-duoc/6logo-fondo-transparente/fondo-transparente.png" id="0" name="image2.png"/>
+                    <pic:cNvPr descr="http://www.duoc.cl/normasgraficas/normasgraficas/marca-duoc/6logo-fondo-transparente/fondo-transparente.png" id="0" name="image1.png"/>
                     <pic:cNvPicPr preferRelativeResize="0"/>
                   </pic:nvPicPr>
                   <pic:blipFill>
@@ -1549,12 +1483,12 @@
           <wp:inline distB="0" distT="0" distL="0" distR="0">
             <wp:extent cx="1996440" cy="428625"/>
             <wp:effectExtent b="0" l="0" r="0" t="0"/>
-            <wp:docPr descr="http://www.duoc.cl/normasgraficas/normasgraficas/marca-duoc/6logo-fondo-transparente/fondo-transparente.png" id="14" name="image2.png"/>
+            <wp:docPr descr="http://www.duoc.cl/normasgraficas/normasgraficas/marca-duoc/6logo-fondo-transparente/fondo-transparente.png" id="10" name="image1.png"/>
             <a:graphic>
               <a:graphicData uri="http://schemas.openxmlformats.org/drawingml/2006/picture">
                 <pic:pic>
                   <pic:nvPicPr>
-                    <pic:cNvPr descr="http://www.duoc.cl/normasgraficas/normasgraficas/marca-duoc/6logo-fondo-transparente/fondo-transparente.png" id="0" name="image2.png"/>
+                    <pic:cNvPr descr="http://www.duoc.cl/normasgraficas/normasgraficas/marca-duoc/6logo-fondo-transparente/fondo-transparente.png" id="0" name="image1.png"/>
                     <pic:cNvPicPr preferRelativeResize="0"/>
                   </pic:nvPicPr>
                   <pic:blipFill>
@@ -1966,12 +1900,12 @@
           <wp:inline distB="0" distT="0" distL="0" distR="0">
             <wp:extent cx="1996440" cy="428625"/>
             <wp:effectExtent b="0" l="0" r="0" t="0"/>
-            <wp:docPr descr="http://www.duoc.cl/normasgraficas/normasgraficas/marca-duoc/6logo-fondo-transparente/fondo-transparente.png" id="15" name="image2.png"/>
+            <wp:docPr descr="http://www.duoc.cl/normasgraficas/normasgraficas/marca-duoc/6logo-fondo-transparente/fondo-transparente.png" id="8" name="image1.png"/>
             <a:graphic>
               <a:graphicData uri="http://schemas.openxmlformats.org/drawingml/2006/picture">
                 <pic:pic>
                   <pic:nvPicPr>
-                    <pic:cNvPr descr="http://www.duoc.cl/normasgraficas/normasgraficas/marca-duoc/6logo-fondo-transparente/fondo-transparente.png" id="0" name="image2.png"/>
+                    <pic:cNvPr descr="http://www.duoc.cl/normasgraficas/normasgraficas/marca-duoc/6logo-fondo-transparente/fondo-transparente.png" id="0" name="image1.png"/>
                     <pic:cNvPicPr preferRelativeResize="0"/>
                   </pic:nvPicPr>
                   <pic:blipFill>
@@ -2334,12 +2268,12 @@
           <wp:inline distB="0" distT="0" distL="0" distR="0">
             <wp:extent cx="1996440" cy="428625"/>
             <wp:effectExtent b="0" l="0" r="0" t="0"/>
-            <wp:docPr descr="http://www.duoc.cl/normasgraficas/normasgraficas/marca-duoc/6logo-fondo-transparente/fondo-transparente.png" id="4" name="image2.png"/>
+            <wp:docPr descr="http://www.duoc.cl/normasgraficas/normasgraficas/marca-duoc/6logo-fondo-transparente/fondo-transparente.png" id="4" name="image1.png"/>
             <a:graphic>
               <a:graphicData uri="http://schemas.openxmlformats.org/drawingml/2006/picture">
                 <pic:pic>
                   <pic:nvPicPr>
-                    <pic:cNvPr descr="http://www.duoc.cl/normasgraficas/normasgraficas/marca-duoc/6logo-fondo-transparente/fondo-transparente.png" id="0" name="image2.png"/>
+                    <pic:cNvPr descr="http://www.duoc.cl/normasgraficas/normasgraficas/marca-duoc/6logo-fondo-transparente/fondo-transparente.png" id="0" name="image1.png"/>
                     <pic:cNvPicPr preferRelativeResize="0"/>
                   </pic:nvPicPr>
                   <pic:blipFill>
@@ -2614,12 +2548,12 @@
           <wp:inline distB="0" distT="0" distL="0" distR="0">
             <wp:extent cx="1996440" cy="428625"/>
             <wp:effectExtent b="0" l="0" r="0" t="0"/>
-            <wp:docPr descr="http://www.duoc.cl/normasgraficas/normasgraficas/marca-duoc/6logo-fondo-transparente/fondo-transparente.png" id="6" name="image2.png"/>
+            <wp:docPr descr="http://www.duoc.cl/normasgraficas/normasgraficas/marca-duoc/6logo-fondo-transparente/fondo-transparente.png" id="11" name="image1.png"/>
             <a:graphic>
               <a:graphicData uri="http://schemas.openxmlformats.org/drawingml/2006/picture">
                 <pic:pic>
                   <pic:nvPicPr>
-                    <pic:cNvPr descr="http://www.duoc.cl/normasgraficas/normasgraficas/marca-duoc/6logo-fondo-transparente/fondo-transparente.png" id="0" name="image2.png"/>
+                    <pic:cNvPr descr="http://www.duoc.cl/normasgraficas/normasgraficas/marca-duoc/6logo-fondo-transparente/fondo-transparente.png" id="0" name="image1.png"/>
                     <pic:cNvPicPr preferRelativeResize="0"/>
                   </pic:nvPicPr>
                   <pic:blipFill>
@@ -3000,12 +2934,12 @@
           <wp:inline distB="0" distT="0" distL="0" distR="0">
             <wp:extent cx="1996440" cy="428625"/>
             <wp:effectExtent b="0" l="0" r="0" t="0"/>
-            <wp:docPr descr="http://www.duoc.cl/normasgraficas/normasgraficas/marca-duoc/6logo-fondo-transparente/fondo-transparente.png" id="12" name="image2.png"/>
+            <wp:docPr descr="http://www.duoc.cl/normasgraficas/normasgraficas/marca-duoc/6logo-fondo-transparente/fondo-transparente.png" id="5" name="image1.png"/>
             <a:graphic>
               <a:graphicData uri="http://schemas.openxmlformats.org/drawingml/2006/picture">
                 <pic:pic>
                   <pic:nvPicPr>
-                    <pic:cNvPr descr="http://www.duoc.cl/normasgraficas/normasgraficas/marca-duoc/6logo-fondo-transparente/fondo-transparente.png" id="0" name="image2.png"/>
+                    <pic:cNvPr descr="http://www.duoc.cl/normasgraficas/normasgraficas/marca-duoc/6logo-fondo-transparente/fondo-transparente.png" id="0" name="image1.png"/>
                     <pic:cNvPicPr preferRelativeResize="0"/>
                   </pic:nvPicPr>
                   <pic:blipFill>
@@ -3357,12 +3291,12 @@
           <wp:inline distB="0" distT="0" distL="0" distR="0">
             <wp:extent cx="1996440" cy="428625"/>
             <wp:effectExtent b="0" l="0" r="0" t="0"/>
-            <wp:docPr descr="http://www.duoc.cl/normasgraficas/normasgraficas/marca-duoc/6logo-fondo-transparente/fondo-transparente.png" id="11" name="image2.png"/>
+            <wp:docPr descr="http://www.duoc.cl/normasgraficas/normasgraficas/marca-duoc/6logo-fondo-transparente/fondo-transparente.png" id="1" name="image1.png"/>
             <a:graphic>
               <a:graphicData uri="http://schemas.openxmlformats.org/drawingml/2006/picture">
                 <pic:pic>
                   <pic:nvPicPr>
-                    <pic:cNvPr descr="http://www.duoc.cl/normasgraficas/normasgraficas/marca-duoc/6logo-fondo-transparente/fondo-transparente.png" id="0" name="image2.png"/>
+                    <pic:cNvPr descr="http://www.duoc.cl/normasgraficas/normasgraficas/marca-duoc/6logo-fondo-transparente/fondo-transparente.png" id="0" name="image1.png"/>
                     <pic:cNvPicPr preferRelativeResize="0"/>
                   </pic:nvPicPr>
                   <pic:blipFill>
@@ -3653,12 +3587,12 @@
           <wp:inline distB="0" distT="0" distL="0" distR="0">
             <wp:extent cx="1996440" cy="428625"/>
             <wp:effectExtent b="0" l="0" r="0" t="0"/>
-            <wp:docPr descr="http://www.duoc.cl/normasgraficas/normasgraficas/marca-duoc/6logo-fondo-transparente/fondo-transparente.png" id="9" name="image2.png"/>
+            <wp:docPr descr="http://www.duoc.cl/normasgraficas/normasgraficas/marca-duoc/6logo-fondo-transparente/fondo-transparente.png" id="12" name="image1.png"/>
             <a:graphic>
               <a:graphicData uri="http://schemas.openxmlformats.org/drawingml/2006/picture">
                 <pic:pic>
                   <pic:nvPicPr>
-                    <pic:cNvPr descr="http://www.duoc.cl/normasgraficas/normasgraficas/marca-duoc/6logo-fondo-transparente/fondo-transparente.png" id="0" name="image2.png"/>
+                    <pic:cNvPr descr="http://www.duoc.cl/normasgraficas/normasgraficas/marca-duoc/6logo-fondo-transparente/fondo-transparente.png" id="0" name="image1.png"/>
                     <pic:cNvPicPr preferRelativeResize="0"/>
                   </pic:nvPicPr>
                   <pic:blipFill>
@@ -4007,12 +3941,12 @@
           <wp:inline distB="0" distT="0" distL="0" distR="0">
             <wp:extent cx="1996440" cy="428625"/>
             <wp:effectExtent b="0" l="0" r="0" t="0"/>
-            <wp:docPr descr="http://www.duoc.cl/normasgraficas/normasgraficas/marca-duoc/6logo-fondo-transparente/fondo-transparente.png" id="1" name="image2.png"/>
+            <wp:docPr descr="http://www.duoc.cl/normasgraficas/normasgraficas/marca-duoc/6logo-fondo-transparente/fondo-transparente.png" id="13" name="image1.png"/>
             <a:graphic>
               <a:graphicData uri="http://schemas.openxmlformats.org/drawingml/2006/picture">
                 <pic:pic>
                   <pic:nvPicPr>
-                    <pic:cNvPr descr="http://www.duoc.cl/normasgraficas/normasgraficas/marca-duoc/6logo-fondo-transparente/fondo-transparente.png" id="0" name="image2.png"/>
+                    <pic:cNvPr descr="http://www.duoc.cl/normasgraficas/normasgraficas/marca-duoc/6logo-fondo-transparente/fondo-transparente.png" id="0" name="image1.png"/>
                     <pic:cNvPicPr preferRelativeResize="0"/>
                   </pic:nvPicPr>
                   <pic:blipFill>
@@ -4423,12 +4357,12 @@
           <wp:inline distB="0" distT="0" distL="0" distR="0">
             <wp:extent cx="1996440" cy="428625"/>
             <wp:effectExtent b="0" l="0" r="0" t="0"/>
-            <wp:docPr descr="http://www.duoc.cl/normasgraficas/normasgraficas/marca-duoc/6logo-fondo-transparente/fondo-transparente.png" id="3" name="image2.png"/>
+            <wp:docPr descr="http://www.duoc.cl/normasgraficas/normasgraficas/marca-duoc/6logo-fondo-transparente/fondo-transparente.png" id="14" name="image1.png"/>
             <a:graphic>
               <a:graphicData uri="http://schemas.openxmlformats.org/drawingml/2006/picture">
                 <pic:pic>
                   <pic:nvPicPr>
-                    <pic:cNvPr descr="http://www.duoc.cl/normasgraficas/normasgraficas/marca-duoc/6logo-fondo-transparente/fondo-transparente.png" id="0" name="image2.png"/>
+                    <pic:cNvPr descr="http://www.duoc.cl/normasgraficas/normasgraficas/marca-duoc/6logo-fondo-transparente/fondo-transparente.png" id="0" name="image1.png"/>
                     <pic:cNvPicPr preferRelativeResize="0"/>
                   </pic:nvPicPr>
                   <pic:blipFill>
@@ -4860,12 +4794,12 @@
           <wp:inline distB="0" distT="0" distL="0" distR="0">
             <wp:extent cx="1996440" cy="428625"/>
             <wp:effectExtent b="0" l="0" r="0" t="0"/>
-            <wp:docPr descr="http://www.duoc.cl/normasgraficas/normasgraficas/marca-duoc/6logo-fondo-transparente/fondo-transparente.png" id="5" name="image2.png"/>
+            <wp:docPr descr="http://www.duoc.cl/normasgraficas/normasgraficas/marca-duoc/6logo-fondo-transparente/fondo-transparente.png" id="6" name="image1.png"/>
             <a:graphic>
               <a:graphicData uri="http://schemas.openxmlformats.org/drawingml/2006/picture">
                 <pic:pic>
                   <pic:nvPicPr>
-                    <pic:cNvPr descr="http://www.duoc.cl/normasgraficas/normasgraficas/marca-duoc/6logo-fondo-transparente/fondo-transparente.png" id="0" name="image2.png"/>
+                    <pic:cNvPr descr="http://www.duoc.cl/normasgraficas/normasgraficas/marca-duoc/6logo-fondo-transparente/fondo-transparente.png" id="0" name="image1.png"/>
                     <pic:cNvPicPr preferRelativeResize="0"/>
                   </pic:nvPicPr>
                   <pic:blipFill>
@@ -5157,7 +5091,6 @@
       </w:r>
     </w:p>
     <w:sectPr>
-      <w:type w:val="nextPage"/>
       <w:pgSz w:h="16834" w:w="11909" w:orient="portrait"/>
       <w:pgMar w:bottom="1440" w:top="1440" w:left="1440" w:right="1440" w:header="720" w:footer="720"/>
       <w:pgNumType w:start="1"/>

</xml_diff>